<commit_message>
modify Phi chuc nang
</commit_message>
<xml_diff>
--- a/Nhom10_REPORT_ApplicationDevelopment.docx
+++ b/Nhom10_REPORT_ApplicationDevelopment.docx
@@ -127,7 +127,7 @@
           </mc:Choice>
           <mc:Fallback>
             <w:pict>
-              <v:shapetype w14:anchorId="4D114D33" id="_x0000_t32" coordsize="21600,21600" o:spt="32" o:oned="t" path="m,l21600,21600e" filled="f">
+              <v:shapetype w14:anchorId="16145623" id="_x0000_t32" coordsize="21600,21600" o:spt="32" o:oned="t" path="m,l21600,21600e" filled="f">
                 <v:path arrowok="t" fillok="f" o:connecttype="none"/>
                 <o:lock v:ext="edit" shapetype="t"/>
               </v:shapetype>
@@ -6884,10 +6884,10 @@
           <w:b/>
           <w:bCs/>
         </w:rPr>
-        <w:t>Bước 2:</w:t>
-      </w:r>
-      <w:r>
-        <w:t xml:space="preserve"> Nhân viên bán hàng sử dụng hệ thống để tìm kiếm (hoặc quét mã) sản phẩm và kiểm tra số lượng tồn kho</w:t>
+        <w:t>Bước 3:</w:t>
+      </w:r>
+      <w:r>
+        <w:t xml:space="preserve"> Nhân viên bán hàng tạo hóa đơn mới, thêm các sản phẩm khách mua vào hóa đơn</w:t>
       </w:r>
       <w:r>
         <w:t>.</w:t>
@@ -6906,10 +6906,10 @@
           <w:b/>
           <w:bCs/>
         </w:rPr>
-        <w:t>Bước 3:</w:t>
-      </w:r>
-      <w:r>
-        <w:t xml:space="preserve"> Nhân viên bán hàng tạo hóa đơn mới, thêm các sản phẩm khách mua vào hóa đơn</w:t>
+        <w:t>Bước 4:</w:t>
+      </w:r>
+      <w:r>
+        <w:t xml:space="preserve"> Nếu khách hàng có sử dụng thêm dịch vụ chăm sóc, nhân viên tiến hành gộp chung chi phí dịch vụ vào hóa đơn này</w:t>
       </w:r>
       <w:r>
         <w:t>.</w:t>
@@ -6928,37 +6928,16 @@
           <w:b/>
           <w:bCs/>
         </w:rPr>
-        <w:t>Bước 4:</w:t>
-      </w:r>
-      <w:r>
-        <w:t xml:space="preserve"> Nếu khách hàng có sử dụng thêm dịch vụ chăm sóc, nhân viên tiến hành gộp chung chi phí dịch vụ vào hóa đơn này</w:t>
+        <w:t>Bước 5:</w:t>
+      </w:r>
+      <w:r>
+        <w:t xml:space="preserve"> Nhân viên bán hàng thu tiền, hệ thống ghi nhận thanh toán thành công, tiến hành in hóa đơn và tự động trừ số lượng sản phẩm trong kho</w:t>
       </w:r>
       <w:r>
         <w:t>.</w:t>
       </w:r>
     </w:p>
-    <w:p>
-      <w:pPr>
-        <w:pStyle w:val="ListParagraph"/>
-        <w:numPr>
-          <w:ilvl w:val="0"/>
-          <w:numId w:val="13"/>
-        </w:numPr>
-      </w:pPr>
-      <w:r>
-        <w:rPr>
-          <w:b/>
-          <w:bCs/>
-        </w:rPr>
-        <w:t>Bước 5:</w:t>
-      </w:r>
-      <w:r>
-        <w:t xml:space="preserve"> Nhân viên bán hàng thu tiền, hệ thống ghi nhận thanh toán thành công, tiến hành in hóa đơn và tự động trừ số lượng sản phẩm trong kho</w:t>
-      </w:r>
-      <w:r>
-        <w:t>.</w:t>
-      </w:r>
-    </w:p>
+    <w:p/>
     <w:p/>
     <w:p/>
     <w:p>
@@ -9267,11 +9246,9 @@
       <w:pPr>
         <w:pStyle w:val="Heading3"/>
       </w:pPr>
-      <w:bookmarkStart w:id="25" w:name="_Toc238642604"/>
-      <w:r>
-        <w:t>An toàn, Bảo mật &amp; Phân quyền</w:t>
-      </w:r>
-      <w:bookmarkEnd w:id="25"/>
+      <w:r>
+        <w:t>Hiệu Suất</w:t>
+      </w:r>
     </w:p>
     <w:p>
       <w:pPr>
@@ -9283,13 +9260,9 @@
       </w:pPr>
       <w:r>
         <w:rPr>
-          <w:b/>
-          <w:bCs/>
-        </w:rPr>
-        <w:t>Kiểm soát giao diện theo vai trò:</w:t>
-      </w:r>
-      <w:r>
-        <w:t xml:space="preserve"> Giao diện ứng dụng phải tự động thay đổi (ẩn/hiện các menu, nút bấm) tương ứng với tài khoản đăng nhập. Ví dụ: Nhân viên chăm sóc không thể nhìn thấy chức năng Lập và in hóa đơn của Nhân viên bán hàng; Nhân viên bán hàng không có quyền truy cập module Báo cáo doanh thu của Chủ cửa hàng</w:t>
+          <w:szCs w:val="26"/>
+        </w:rPr>
+        <w:t>Thời gian phản hồi của các chức năng đăng nhập, tìm kiếm, tra cứu khách hàng, thú cưng, sản phẩm, dịch vụ, lịch hẹn và hóa đơn không vượt quá 2 giây trong điều kiện hệ thống hoạt động bình thường</w:t>
       </w:r>
       <w:r>
         <w:t>.</w:t>
@@ -9305,13 +9278,9 @@
       </w:pPr>
       <w:r>
         <w:rPr>
-          <w:b/>
-          <w:bCs/>
-        </w:rPr>
-        <w:t>Quản lý phiên làm việc:</w:t>
-      </w:r>
-      <w:r>
-        <w:t xml:space="preserve"> Để tránh rủi ro khi nhân viên rời khỏi quầy, hệ thống tự động khóa màn hình hoặc đăng xuất tài khoản sau 10 phút không có thao tác chuột hoặc bàn phím</w:t>
+          <w:szCs w:val="26"/>
+        </w:rPr>
+        <w:t>Thời gian mở các màn hình chức năng chính không vượt quá 3 giây kể từ khi người dùng thực hiện thao tác truy cập</w:t>
       </w:r>
       <w:r>
         <w:t>.</w:t>
@@ -9327,16 +9296,20 @@
       </w:pPr>
       <w:r>
         <w:rPr>
-          <w:b/>
-          <w:bCs/>
-        </w:rPr>
-        <w:t>Lưu vết hệ thống (System Logging):</w:t>
-      </w:r>
-      <w:r>
-        <w:t xml:space="preserve"> Mọi thao tác làm thay đổi dữ liệu quan trọng (như Chủ cửa hàng xóa sản phẩm, Nhân viên bán hàng hủy hóa đơn, Nhân viên chăm sóc đổi trạng thái lịch hẹn) đều phải được hệ thống ghi log ẩn dưới cơ sở dữ liệu, lưu rõ thông tin tài khoản thực hiện và thời gian</w:t>
+          <w:szCs w:val="26"/>
+        </w:rPr>
+        <w:t>Khi lập hóa đơn, hệ thống phải hoàn thành việc lưu hóa đơn và cập nhật tồn kho trong cùng một giao dịch cơ sở dữ liệu, với thời gian xử lý không vượt quá 3 giây trong điều kiện dữ liệu hợp lệ</w:t>
       </w:r>
       <w:r>
         <w:t>.</w:t>
+      </w:r>
+    </w:p>
+    <w:p>
+      <w:pPr>
+        <w:pStyle w:val="Heading3"/>
+      </w:pPr>
+      <w:r>
+        <w:t>Tính tương thích</w:t>
       </w:r>
     </w:p>
     <w:p>
@@ -9349,28 +9322,13 @@
       </w:pPr>
       <w:r>
         <w:rPr>
-          <w:b/>
-          <w:bCs/>
-        </w:rPr>
-        <w:lastRenderedPageBreak/>
-        <w:t>Mã hóa dữ liệu xác thực:</w:t>
-      </w:r>
-      <w:r>
-        <w:t xml:space="preserve"> Mật khẩu của cả 3 nhóm người dùng phải được mã hóa một chiều (Sử dụng SHA-256 hoặc BCrypt) trước khi lưu vào cơ sở dữ liệu</w:t>
+          <w:szCs w:val="26"/>
+        </w:rPr>
+        <w:t>Hệ thống phải hoạt động ổn định trên máy tính sử dụng Windows 10 và Windows 11</w:t>
       </w:r>
       <w:r>
         <w:t>.</w:t>
       </w:r>
-    </w:p>
-    <w:p>
-      <w:pPr>
-        <w:pStyle w:val="Heading3"/>
-      </w:pPr>
-      <w:bookmarkStart w:id="26" w:name="_Toc238642605"/>
-      <w:r>
-        <w:t>Hiệu năng &amp; Thời gian phản hồi</w:t>
-      </w:r>
-      <w:bookmarkEnd w:id="26"/>
     </w:p>
     <w:p>
       <w:pPr>
@@ -9382,13 +9340,9 @@
       </w:pPr>
       <w:r>
         <w:rPr>
-          <w:b/>
-          <w:bCs/>
-        </w:rPr>
-        <w:t>Tốc độ tra cứu:</w:t>
-      </w:r>
-      <w:r>
-        <w:t xml:space="preserve"> Các thao tác tra cứu tần suất cao tại quầy (Nhân viên bán hàng tìm sản phẩm, quét mã vạch, Nhân viên chăm sóc tìm hồ sơ thú cưng) phải trả về kết quả trong thời gian tối đa 2 giây</w:t>
+          <w:szCs w:val="26"/>
+        </w:rPr>
+        <w:t>Hệ thống phải tương thích với Java Runtime Environment (JRE) phiên bản được nhóm quy định trong quá trình triển khai</w:t>
       </w:r>
       <w:r>
         <w:t>.</w:t>
@@ -9404,15 +9358,15 @@
       </w:pPr>
       <w:r>
         <w:rPr>
-          <w:b/>
-          <w:bCs/>
-        </w:rPr>
-        <w:t>Xử lý đồng thời (Concurrency):</w:t>
-      </w:r>
-      <w:r>
-        <w:t xml:space="preserve"> Hệ thống phải đảm bảo hoạt động ổn định, không bị xung đột dữ liệu khi nhiều nhân viên cùng thao tác vào một thời điểm (Ví dụ: Nhân viên bán hàng A đang lập đơn và Nhân viên bán hàng B đang thanh toán một đơn khác)</w:t>
-      </w:r>
-      <w:r>
+          <w:szCs w:val="26"/>
+        </w:rPr>
+        <w:lastRenderedPageBreak/>
+        <w:t>Hệ thống phải kết nối và thực hiện được các thao tác thêm, sửa, xóa, tìm kiếm và truy vấn dữ liệu trên SQL Server theo phiên bản được nhóm sử dụng</w:t>
+      </w:r>
+      <w:r>
+        <w:rPr>
+          <w:szCs w:val="26"/>
+        </w:rPr>
         <w:t>.</w:t>
       </w:r>
     </w:p>
@@ -9420,11 +9374,9 @@
       <w:pPr>
         <w:pStyle w:val="Heading3"/>
       </w:pPr>
-      <w:bookmarkStart w:id="27" w:name="_Toc238642606"/>
-      <w:r>
-        <w:t>Giao diện &amp; Khả năng sử dụng</w:t>
-      </w:r>
-      <w:bookmarkEnd w:id="27"/>
+      <w:r>
+        <w:t>Tính tin cậy</w:t>
+      </w:r>
     </w:p>
     <w:p>
       <w:pPr>
@@ -9440,34 +9392,16 @@
       </w:pPr>
       <w:r>
         <w:rPr>
+          <w:szCs w:val="26"/>
+        </w:rPr>
+        <w:t>Tỷ lệ giao dịch lập hóa đơn thành công phải đạt tối thiểu 99% trong điều kiện dữ liệu đầu vào hợp lệ và cơ sở dữ liệu hoạt động bình thường</w:t>
+      </w:r>
+      <w:r>
+        <w:rPr>
           <w:b/>
           <w:bCs/>
         </w:rPr>
-        <w:t>Tối ưu luồng thao tác:</w:t>
-      </w:r>
-    </w:p>
-    <w:p>
-      <w:pPr>
-        <w:pStyle w:val="ListParagraph"/>
-        <w:numPr>
-          <w:ilvl w:val="0"/>
-          <w:numId w:val="16"/>
-        </w:numPr>
-      </w:pPr>
-      <w:r>
-        <w:t>Đối với Nhân viên bán hàng: Hỗ trợ tối đa các phím tắt bàn phím (ví dụ: F2 để tạo đơn mới, F9 để thanh toán, Enter để tìm kiếm) giúp thao tác nhanh khi đông khách.</w:t>
-      </w:r>
-    </w:p>
-    <w:p>
-      <w:pPr>
-        <w:pStyle w:val="ListParagraph"/>
-        <w:numPr>
-          <w:ilvl w:val="0"/>
-          <w:numId w:val="16"/>
-        </w:numPr>
-      </w:pPr>
-      <w:r>
-        <w:t>Đối với Nhân viên chăm sóc: Cung cấp giao diện trực quan, dễ nhìn để theo dõi và cập nhật trạng thái lịch hẹn nhanh chóng.</w:t>
+        <w:t>.</w:t>
       </w:r>
     </w:p>
     <w:p>
@@ -9480,13 +9414,9 @@
       </w:pPr>
       <w:r>
         <w:rPr>
-          <w:b/>
-          <w:bCs/>
-        </w:rPr>
-        <w:t>Tính thống nhất:</w:t>
-      </w:r>
-      <w:r>
-        <w:t xml:space="preserve"> Ứng dụng phải duy trì sự đồng nhất về màu sắc, phông chữ, kích thước nút bấm và vị trí thanh điều hướng trên toàn bộ các màn hình của hệ thống</w:t>
+          <w:szCs w:val="26"/>
+        </w:rPr>
+        <w:t>Khi xảy ra lỗi trong quá trình lập hóa đơn hoặc cập nhật tồn kho, hệ thống phải hoàn tác toàn bộ giao dịch, không để xảy ra trường hợp hóa đơn đã được lưu nhưng tồn kho chưa được cập nhật</w:t>
       </w:r>
       <w:r>
         <w:t>.</w:t>
@@ -9502,27 +9432,13 @@
       </w:pPr>
       <w:r>
         <w:rPr>
-          <w:b/>
-          <w:bCs/>
-        </w:rPr>
-        <w:t>Xử lý lỗi thân thiện:</w:t>
-      </w:r>
-      <w:r>
-        <w:t xml:space="preserve"> Khi có lỗi ngoại lệ (nhập sai định dạng, mất kết nối cơ sở dữ liệu), hệ thống phải hiển thị thông báo bằng tiếng Việt có dấu, mô tả rõ nguyên nhân thay vì hiển thị mã lỗi kỹ thuật</w:t>
+          <w:szCs w:val="26"/>
+        </w:rPr>
+        <w:t>Hệ thống phải kiểm tra dữ liệu trước khi lưu và không cho phép lưu các trường bắt buộc bị bỏ trống hoặc dữ liệu sai định dạng</w:t>
       </w:r>
       <w:r>
         <w:t>.</w:t>
       </w:r>
-    </w:p>
-    <w:p>
-      <w:pPr>
-        <w:pStyle w:val="Heading3"/>
-      </w:pPr>
-      <w:bookmarkStart w:id="28" w:name="_Toc238642607"/>
-      <w:r>
-        <w:t>Ràng buộc Kỹ thuật &amp; Thiết bị ngoại vi</w:t>
-      </w:r>
-      <w:bookmarkEnd w:id="28"/>
     </w:p>
     <w:p>
       <w:pPr>
@@ -9534,13 +9450,23 @@
       </w:pPr>
       <w:r>
         <w:rPr>
-          <w:b/>
-          <w:bCs/>
-        </w:rPr>
-        <w:t>Tích hợp thiết bị:</w:t>
-      </w:r>
-      <w:r>
-        <w:t xml:space="preserve"> Module của Nhân viên bán hàng phải tương thích và nhận diện được dữ liệu từ máy quét mã vạch, đồng thời có khả năng xuất lệnh in trực tiếp tới máy in hóa đơn nhiệt qua cổng USB/LAN.</w:t>
+          <w:szCs w:val="26"/>
+        </w:rPr>
+        <w:t>Số lượng tồn kho không được phép nhỏ hơn 0; số lượng sản phẩm trong hóa đơn phải là số nguyên lớn hơn 0</w:t>
+      </w:r>
+      <w:r>
+        <w:rPr>
+          <w:szCs w:val="26"/>
+        </w:rPr>
+        <w:t>.</w:t>
+      </w:r>
+    </w:p>
+    <w:p>
+      <w:pPr>
+        <w:pStyle w:val="Heading3"/>
+      </w:pPr>
+      <w:r>
+        <w:t>An toàn thông tin</w:t>
       </w:r>
     </w:p>
     <w:p>
@@ -9553,17 +9479,12 @@
       </w:pPr>
       <w:r>
         <w:rPr>
-          <w:b/>
-          <w:bCs/>
-        </w:rPr>
-        <w:t>Tính toàn vẹn giao dịch (Transaction Integrity):</w:t>
-      </w:r>
-      <w:r>
-        <w:t xml:space="preserve"> Mọi giao dịch thanh toán phải đảm bảo tính toàn vẹn. Nếu quá trình lưu hóa đơn thành công nhưng việc trừ số lượng tồn kho bị lỗi giữa chừng, hệ thống phải tự động </w:t>
-      </w:r>
-      <w:r>
-        <w:lastRenderedPageBreak/>
-        <w:t>hoàn tác (Rollback) toàn bộ giao dịch để đảm bảo dữ liệu không bị sai lệch.</w:t>
+          <w:szCs w:val="26"/>
+        </w:rPr>
+        <w:t>Người dùng phải đăng nhập trước khi truy cập các chức năng của hệ thống</w:t>
+      </w:r>
+      <w:r>
+        <w:t>.</w:t>
       </w:r>
     </w:p>
     <w:p>
@@ -9576,13 +9497,45 @@
       </w:pPr>
       <w:r>
         <w:rPr>
-          <w:b/>
-          <w:bCs/>
-        </w:rPr>
-        <w:t>Nền tảng triển khai:</w:t>
-      </w:r>
-      <w:r>
-        <w:t xml:space="preserve"> Ứng dụng được xây dựng theo kiến trúc Web-based. Backend sử dụng ngôn ngữ Java (ứng dụng Stream API để xử lý luồng dữ liệu), Frontend sử dụng HTML, CSS (Bootstrap) và JavaScript (jQuery). Hệ thống kết nối với cơ sở dữ liệu MongoDB (có khả năng mở rộng thông qua Sharding và Replication). Tệp cấu hình kết nối CSDL phải được tách riêng khỏi mã nguồn chính.</w:t>
+          <w:szCs w:val="26"/>
+        </w:rPr>
+        <w:t>Người dùng chỉ được thực hiện các chức năng được phân quyền; các chức năng không có quyền phải bị từ chối truy cập</w:t>
+      </w:r>
+      <w:r>
+        <w:t>.</w:t>
+      </w:r>
+    </w:p>
+    <w:p>
+      <w:pPr>
+        <w:pStyle w:val="ListParagraph"/>
+        <w:numPr>
+          <w:ilvl w:val="0"/>
+          <w:numId w:val="10"/>
+        </w:numPr>
+      </w:pPr>
+      <w:r>
+        <w:rPr>
+          <w:szCs w:val="26"/>
+        </w:rPr>
+        <w:t>Hệ thống phải tự động đăng xuất tài khoản sau 10 phút không có thao tác</w:t>
+      </w:r>
+      <w:r>
+        <w:t>.</w:t>
+      </w:r>
+    </w:p>
+    <w:p>
+      <w:pPr>
+        <w:pStyle w:val="ListParagraph"/>
+        <w:numPr>
+          <w:ilvl w:val="0"/>
+          <w:numId w:val="10"/>
+        </w:numPr>
+      </w:pPr>
+      <w:r>
+        <w:rPr>
+          <w:szCs w:val="26"/>
+        </w:rPr>
+        <w:t>Các thao tác thêm, sửa, xóa dữ liệu quan trọng phải được ghi nhận tài khoản thực hiện và thời gian thực hiện</w:t>
       </w:r>
     </w:p>
     <w:p>
@@ -9598,11 +9551,11 @@
       <w:pPr>
         <w:pStyle w:val="Heading1"/>
       </w:pPr>
-      <w:bookmarkStart w:id="29" w:name="_Toc238642608"/>
+      <w:bookmarkStart w:id="25" w:name="_Toc238642608"/>
       <w:r>
         <w:t>CƠ SỞ LÝ THUYẾT</w:t>
       </w:r>
-      <w:bookmarkEnd w:id="29"/>
+      <w:bookmarkEnd w:id="25"/>
     </w:p>
     <w:p>
       <w:pPr>
@@ -9615,7 +9568,7 @@
           <w:color w:val="548DD4" w:themeColor="text2" w:themeTint="99"/>
         </w:rPr>
       </w:pPr>
-      <w:bookmarkStart w:id="30" w:name="_Toc169424247"/>
+      <w:bookmarkStart w:id="26" w:name="_Toc169424247"/>
       <w:bookmarkEnd w:id="1"/>
       <w:r>
         <w:rPr>
@@ -9647,11 +9600,11 @@
       <w:pPr>
         <w:pStyle w:val="Heading2"/>
       </w:pPr>
-      <w:bookmarkStart w:id="31" w:name="_Toc238642609"/>
+      <w:bookmarkStart w:id="27" w:name="_Toc238642609"/>
       <w:r>
         <w:t>Tổng quan các công nghệ sử dụng</w:t>
       </w:r>
-      <w:bookmarkEnd w:id="31"/>
+      <w:bookmarkEnd w:id="27"/>
       <w:r>
         <w:t xml:space="preserve"> </w:t>
       </w:r>
@@ -9660,11 +9613,11 @@
       <w:pPr>
         <w:pStyle w:val="Heading2"/>
       </w:pPr>
-      <w:bookmarkStart w:id="32" w:name="_Toc238642610"/>
+      <w:bookmarkStart w:id="28" w:name="_Toc238642610"/>
       <w:r>
         <w:t>Cơ sở lý thuyết về các công nghệ chính</w:t>
       </w:r>
-      <w:bookmarkEnd w:id="32"/>
+      <w:bookmarkEnd w:id="28"/>
       <w:r>
         <w:t xml:space="preserve"> </w:t>
       </w:r>
@@ -9735,12 +9688,12 @@
           <w:color w:val="FF0000"/>
         </w:rPr>
       </w:pPr>
-      <w:bookmarkStart w:id="33" w:name="_Toc238642611"/>
+      <w:bookmarkStart w:id="29" w:name="_Toc238642611"/>
       <w:r>
         <w:lastRenderedPageBreak/>
         <w:t>PHÂN TÍCH</w:t>
       </w:r>
-      <w:bookmarkEnd w:id="33"/>
+      <w:bookmarkEnd w:id="29"/>
       <w:r>
         <w:t xml:space="preserve"> </w:t>
       </w:r>
@@ -9794,12 +9747,12 @@
           <w:numId w:val="3"/>
         </w:numPr>
       </w:pPr>
-      <w:bookmarkStart w:id="34" w:name="_Toc238642612"/>
+      <w:bookmarkStart w:id="30" w:name="_Toc238642612"/>
+      <w:bookmarkEnd w:id="26"/>
+      <w:r>
+        <w:t>Mô hình UseCase tổng quát:</w:t>
+      </w:r>
       <w:bookmarkEnd w:id="30"/>
-      <w:r>
-        <w:t>Mô hình UseCase tổng quát:</w:t>
-      </w:r>
-      <w:bookmarkEnd w:id="34"/>
     </w:p>
     <w:p>
       <w:pPr>
@@ -9825,11 +9778,11 @@
       <w:pPr>
         <w:pStyle w:val="Heading2"/>
       </w:pPr>
-      <w:bookmarkStart w:id="35" w:name="_Toc238642613"/>
+      <w:bookmarkStart w:id="31" w:name="_Toc238642613"/>
       <w:r>
         <w:t>Danh sách các tác nhân và mô tả:</w:t>
       </w:r>
-      <w:bookmarkEnd w:id="35"/>
+      <w:bookmarkEnd w:id="31"/>
     </w:p>
     <w:p>
       <w:pPr>
@@ -10073,11 +10026,11 @@
       <w:pPr>
         <w:pStyle w:val="Heading2"/>
       </w:pPr>
-      <w:bookmarkStart w:id="36" w:name="_Toc238642614"/>
+      <w:bookmarkStart w:id="32" w:name="_Toc238642614"/>
       <w:r>
         <w:t>Danh sách các UseCase:</w:t>
       </w:r>
-      <w:bookmarkEnd w:id="36"/>
+      <w:bookmarkEnd w:id="32"/>
     </w:p>
     <w:p>
       <w:pPr>
@@ -10534,13 +10487,13 @@
       <w:pPr>
         <w:pStyle w:val="Heading2"/>
       </w:pPr>
-      <w:bookmarkStart w:id="37" w:name="_Toc83627364"/>
-      <w:bookmarkStart w:id="38" w:name="_Toc238642615"/>
+      <w:bookmarkStart w:id="33" w:name="_Toc83627364"/>
+      <w:bookmarkStart w:id="34" w:name="_Toc238642615"/>
       <w:r>
         <w:t>ĐẶC TẢ CÁC YÊU CẦU CHỨC NĂNG (FUNCTIONAL)</w:t>
       </w:r>
-      <w:bookmarkEnd w:id="37"/>
-      <w:bookmarkEnd w:id="38"/>
+      <w:bookmarkEnd w:id="33"/>
+      <w:bookmarkEnd w:id="34"/>
     </w:p>
     <w:p>
       <w:pPr>
@@ -10564,31 +10517,31 @@
       <w:pPr>
         <w:pStyle w:val="Heading3"/>
       </w:pPr>
-      <w:bookmarkStart w:id="39" w:name="_Toc207611056"/>
-      <w:bookmarkStart w:id="40" w:name="_Toc83627365"/>
-      <w:bookmarkStart w:id="41" w:name="_Toc238642616"/>
+      <w:bookmarkStart w:id="35" w:name="_Toc207611056"/>
+      <w:bookmarkStart w:id="36" w:name="_Toc83627365"/>
+      <w:bookmarkStart w:id="37" w:name="_Toc238642616"/>
       <w:r>
         <w:lastRenderedPageBreak/>
         <w:t>UC001_Tên use case</w:t>
       </w:r>
+      <w:bookmarkEnd w:id="35"/>
+      <w:bookmarkEnd w:id="36"/>
+      <w:bookmarkEnd w:id="37"/>
+      <w:r>
+        <w:t xml:space="preserve"> </w:t>
+      </w:r>
+    </w:p>
+    <w:p>
+      <w:pPr>
+        <w:pStyle w:val="Heading4"/>
+      </w:pPr>
+      <w:bookmarkStart w:id="38" w:name="_Toc207611057"/>
+      <w:bookmarkStart w:id="39" w:name="_Toc83627366"/>
+      <w:r>
+        <w:t>Mô tả use case UC001</w:t>
+      </w:r>
+      <w:bookmarkEnd w:id="38"/>
       <w:bookmarkEnd w:id="39"/>
-      <w:bookmarkEnd w:id="40"/>
-      <w:bookmarkEnd w:id="41"/>
-      <w:r>
-        <w:t xml:space="preserve"> </w:t>
-      </w:r>
-    </w:p>
-    <w:p>
-      <w:pPr>
-        <w:pStyle w:val="Heading4"/>
-      </w:pPr>
-      <w:bookmarkStart w:id="42" w:name="_Toc207611057"/>
-      <w:bookmarkStart w:id="43" w:name="_Toc83627366"/>
-      <w:r>
-        <w:t>Mô tả use case UC001</w:t>
-      </w:r>
-      <w:bookmarkEnd w:id="42"/>
-      <w:bookmarkEnd w:id="43"/>
     </w:p>
     <w:tbl>
       <w:tblPr>
@@ -11136,7 +11089,7 @@
           <w:lang w:val="pt-BR"/>
         </w:rPr>
       </w:pPr>
-      <w:bookmarkStart w:id="44" w:name="_Toc207611059"/>
+      <w:bookmarkStart w:id="40" w:name="_Toc207611059"/>
       <w:r>
         <w:rPr>
           <w:i/>
@@ -11166,30 +11119,30 @@
       <w:pPr>
         <w:pStyle w:val="Heading3"/>
       </w:pPr>
-      <w:bookmarkStart w:id="45" w:name="_Toc83627368"/>
-      <w:bookmarkStart w:id="46" w:name="_Toc238642617"/>
+      <w:bookmarkStart w:id="41" w:name="_Toc83627368"/>
+      <w:bookmarkStart w:id="42" w:name="_Toc238642617"/>
       <w:r>
         <w:lastRenderedPageBreak/>
         <w:t>UC002_Tên use case</w:t>
       </w:r>
+      <w:bookmarkEnd w:id="40"/>
+      <w:bookmarkEnd w:id="41"/>
+      <w:bookmarkEnd w:id="42"/>
+      <w:r>
+        <w:t xml:space="preserve"> </w:t>
+      </w:r>
+    </w:p>
+    <w:p>
+      <w:pPr>
+        <w:pStyle w:val="Heading4"/>
+      </w:pPr>
+      <w:bookmarkStart w:id="43" w:name="_Toc207611060"/>
+      <w:bookmarkStart w:id="44" w:name="_Toc83627369"/>
+      <w:r>
+        <w:t>Mô tả use case UC002</w:t>
+      </w:r>
+      <w:bookmarkEnd w:id="43"/>
       <w:bookmarkEnd w:id="44"/>
-      <w:bookmarkEnd w:id="45"/>
-      <w:bookmarkEnd w:id="46"/>
-      <w:r>
-        <w:t xml:space="preserve"> </w:t>
-      </w:r>
-    </w:p>
-    <w:p>
-      <w:pPr>
-        <w:pStyle w:val="Heading4"/>
-      </w:pPr>
-      <w:bookmarkStart w:id="47" w:name="_Toc207611060"/>
-      <w:bookmarkStart w:id="48" w:name="_Toc83627369"/>
-      <w:r>
-        <w:t>Mô tả use case UC002</w:t>
-      </w:r>
-      <w:bookmarkEnd w:id="47"/>
-      <w:bookmarkEnd w:id="48"/>
     </w:p>
     <w:tbl>
       <w:tblPr>
@@ -11700,7 +11653,7 @@
       <w:pPr>
         <w:pStyle w:val="Heading3"/>
       </w:pPr>
-      <w:bookmarkStart w:id="49" w:name="_Toc238642618"/>
+      <w:bookmarkStart w:id="45" w:name="_Toc238642618"/>
       <w:r>
         <w:lastRenderedPageBreak/>
         <w:t>UC00</w:t>
@@ -11711,7 +11664,7 @@
       <w:r>
         <w:t>_Tên use case</w:t>
       </w:r>
-      <w:bookmarkEnd w:id="49"/>
+      <w:bookmarkEnd w:id="45"/>
       <w:r>
         <w:t xml:space="preserve"> </w:t>
       </w:r>
@@ -12241,25 +12194,25 @@
           <w:numId w:val="0"/>
         </w:numPr>
       </w:pPr>
-      <w:bookmarkStart w:id="50" w:name="_Toc238642619"/>
+      <w:bookmarkStart w:id="46" w:name="_Toc238642619"/>
       <w:r>
         <w:t>CHƯƠNG 3</w:t>
       </w:r>
       <w:r>
         <w:t>:</w:t>
       </w:r>
-      <w:bookmarkStart w:id="51" w:name="_Toc169424250"/>
+      <w:bookmarkStart w:id="47" w:name="_Toc169424250"/>
       <w:r>
         <w:t xml:space="preserve"> </w:t>
       </w:r>
       <w:r>
         <w:t xml:space="preserve">THIẾT KẾ VÀ </w:t>
       </w:r>
-      <w:bookmarkEnd w:id="51"/>
+      <w:bookmarkEnd w:id="47"/>
       <w:r>
         <w:t>HIỆN THỰC</w:t>
       </w:r>
-      <w:bookmarkEnd w:id="50"/>
+      <w:bookmarkEnd w:id="46"/>
     </w:p>
     <w:p>
       <w:pPr>
@@ -12286,36 +12239,36 @@
           <w:numId w:val="6"/>
         </w:numPr>
       </w:pPr>
-      <w:bookmarkStart w:id="52" w:name="_Toc238642620"/>
+      <w:bookmarkStart w:id="48" w:name="_Toc238642620"/>
       <w:r>
         <w:t>Thiết kế sơ đồ lớp</w:t>
       </w:r>
       <w:r>
         <w:t xml:space="preserve"> (Class Diagram)</w:t>
       </w:r>
-      <w:bookmarkEnd w:id="52"/>
+      <w:bookmarkEnd w:id="48"/>
     </w:p>
     <w:p/>
     <w:p>
       <w:pPr>
         <w:pStyle w:val="Heading3"/>
       </w:pPr>
-      <w:bookmarkStart w:id="53" w:name="_Toc238642621"/>
+      <w:bookmarkStart w:id="49" w:name="_Toc238642621"/>
       <w:r>
         <w:t>Class Driagram</w:t>
       </w:r>
-      <w:bookmarkEnd w:id="53"/>
+      <w:bookmarkEnd w:id="49"/>
     </w:p>
     <w:p/>
     <w:p>
       <w:pPr>
         <w:pStyle w:val="Heading3"/>
       </w:pPr>
-      <w:bookmarkStart w:id="54" w:name="_Toc238642622"/>
+      <w:bookmarkStart w:id="50" w:name="_Toc238642622"/>
       <w:r>
         <w:t>Đặt tả Class Diagram</w:t>
       </w:r>
-      <w:bookmarkEnd w:id="54"/>
+      <w:bookmarkEnd w:id="50"/>
     </w:p>
     <w:p>
       <w:pPr>
@@ -15032,17 +14985,17 @@
       <w:pPr>
         <w:pStyle w:val="Heading2"/>
       </w:pPr>
-      <w:bookmarkStart w:id="55" w:name="_Toc238642623"/>
+      <w:bookmarkStart w:id="51" w:name="_Toc238642623"/>
       <w:r>
         <w:t>Thiết kế Cơ Sở Dữ Liệu</w:t>
       </w:r>
-      <w:bookmarkEnd w:id="55"/>
+      <w:bookmarkEnd w:id="51"/>
     </w:p>
     <w:p>
       <w:pPr>
         <w:pStyle w:val="Heading3"/>
       </w:pPr>
-      <w:bookmarkStart w:id="56" w:name="_Toc238642624"/>
+      <w:bookmarkStart w:id="52" w:name="_Toc238642624"/>
       <w:r>
         <w:t xml:space="preserve">Sơ đồ </w:t>
       </w:r>
@@ -15061,7 +15014,7 @@
       <w:r>
         <w:t>)</w:t>
       </w:r>
-      <w:bookmarkEnd w:id="56"/>
+      <w:bookmarkEnd w:id="52"/>
     </w:p>
     <w:p>
       <w:r>
@@ -15069,7 +15022,7 @@
           <w:noProof/>
         </w:rPr>
         <w:drawing>
-          <wp:inline distT="0" distB="0" distL="0" distR="0" wp14:anchorId="7BB8721A" wp14:editId="18EBA629">
+          <wp:inline distT="0" distB="0" distL="0" distR="0" wp14:anchorId="7BB8721A" wp14:editId="5AD571AA">
             <wp:extent cx="1639614" cy="589327"/>
             <wp:effectExtent l="0" t="0" r="0" b="0"/>
             <wp:docPr id="972141918" name="Picture 1"/>
@@ -15116,7 +15069,7 @@
       <w:pPr>
         <w:pStyle w:val="Heading3"/>
       </w:pPr>
-      <w:bookmarkStart w:id="57" w:name="_Toc238642625"/>
+      <w:bookmarkStart w:id="53" w:name="_Toc238642625"/>
       <w:r>
         <w:rPr>
           <w:rFonts w:cs="Times New Roman"/>
@@ -15126,7 +15079,7 @@
       <w:r>
         <w:t>:</w:t>
       </w:r>
-      <w:bookmarkEnd w:id="57"/>
+      <w:bookmarkEnd w:id="53"/>
     </w:p>
     <w:p>
       <w:pPr>
@@ -15172,14 +15125,14 @@
       <w:pPr>
         <w:pStyle w:val="Heading3"/>
       </w:pPr>
-      <w:bookmarkStart w:id="58" w:name="_Toc238642626"/>
+      <w:bookmarkStart w:id="54" w:name="_Toc238642626"/>
       <w:r>
         <w:t>Các ràng buộc toàn vẹn trong CSDL</w:t>
       </w:r>
       <w:r>
         <w:t>:</w:t>
       </w:r>
-      <w:bookmarkEnd w:id="58"/>
+      <w:bookmarkEnd w:id="54"/>
       <w:r>
         <w:t xml:space="preserve"> </w:t>
       </w:r>
@@ -15199,7 +15152,7 @@
       <w:pPr>
         <w:pStyle w:val="Heading2"/>
       </w:pPr>
-      <w:bookmarkStart w:id="59" w:name="_Toc238642627"/>
+      <w:bookmarkStart w:id="55" w:name="_Toc238642627"/>
       <w:r>
         <w:rPr>
           <w:rFonts w:cs="Times New Roman"/>
@@ -15213,7 +15166,7 @@
       <w:r>
         <w:t>:</w:t>
       </w:r>
-      <w:bookmarkEnd w:id="59"/>
+      <w:bookmarkEnd w:id="55"/>
     </w:p>
     <w:p>
       <w:pPr>
@@ -15300,7 +15253,7 @@
           </mc:Choice>
           <mc:Fallback>
             <w:pict>
-              <v:rect w14:anchorId="068890B6" id="Rectangle 10" o:spid="_x0000_s1026" style="position:absolute;margin-left:9.95pt;margin-top:157.05pt;width:47.5pt;height:19pt;z-index:251666432;visibility:visible;mso-wrap-style:square;mso-height-percent:0;mso-wrap-distance-left:9pt;mso-wrap-distance-top:0;mso-wrap-distance-right:9pt;mso-wrap-distance-bottom:0;mso-position-horizontal:absolute;mso-position-horizontal-relative:text;mso-position-vertical:absolute;mso-position-vertical-relative:text;mso-height-percent:0;mso-height-relative:margin;v-text-anchor:middle" o:gfxdata="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" fillcolor="#fabf8f [1945]" strokecolor="#243f60 [1604]" strokeweight="2pt"/>
+              <v:rect w14:anchorId="581D0984" id="Rectangle 10" o:spid="_x0000_s1026" style="position:absolute;margin-left:9.95pt;margin-top:157.05pt;width:47.5pt;height:19pt;z-index:251666432;visibility:visible;mso-wrap-style:square;mso-height-percent:0;mso-wrap-distance-left:9pt;mso-wrap-distance-top:0;mso-wrap-distance-right:9pt;mso-wrap-distance-bottom:0;mso-position-horizontal:absolute;mso-position-horizontal-relative:text;mso-position-vertical:absolute;mso-position-vertical-relative:text;mso-height-percent:0;mso-height-relative:margin;v-text-anchor:middle" o:gfxdata="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" fillcolor="#fabf8f [1945]" strokecolor="#243f60 [1604]" strokeweight="2pt"/>
             </w:pict>
           </mc:Fallback>
         </mc:AlternateContent>
@@ -15374,7 +15327,7 @@
           </mc:Choice>
           <mc:Fallback>
             <w:pict>
-              <v:rect w14:anchorId="6E0FAF69" id="Rectangle 11" o:spid="_x0000_s1026" style="position:absolute;margin-left:10.25pt;margin-top:180.3pt;width:47.5pt;height:19pt;z-index:251667456;visibility:visible;mso-wrap-style:square;mso-height-percent:0;mso-wrap-distance-left:9pt;mso-wrap-distance-top:0;mso-wrap-distance-right:9pt;mso-wrap-distance-bottom:0;mso-position-horizontal:absolute;mso-position-horizontal-relative:text;mso-position-vertical:absolute;mso-position-vertical-relative:text;mso-height-percent:0;mso-height-relative:margin;v-text-anchor:middle" o:gfxdata="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" fillcolor="#c00000" strokecolor="#243f60 [1604]" strokeweight="2pt"/>
+              <v:rect w14:anchorId="403547DE" id="Rectangle 11" o:spid="_x0000_s1026" style="position:absolute;margin-left:10.25pt;margin-top:180.3pt;width:47.5pt;height:19pt;z-index:251667456;visibility:visible;mso-wrap-style:square;mso-height-percent:0;mso-wrap-distance-left:9pt;mso-wrap-distance-top:0;mso-wrap-distance-right:9pt;mso-wrap-distance-bottom:0;mso-position-horizontal:absolute;mso-position-horizontal-relative:text;mso-position-vertical:absolute;mso-position-vertical-relative:text;mso-height-percent:0;mso-height-relative:margin;v-text-anchor:middle" o:gfxdata="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" fillcolor="#c00000" strokecolor="#243f60 [1604]" strokeweight="2pt"/>
             </w:pict>
           </mc:Fallback>
         </mc:AlternateContent>
@@ -15450,7 +15403,7 @@
           </mc:Choice>
           <mc:Fallback>
             <w:pict>
-              <v:rect w14:anchorId="007E7E93" id="Rectangle 13" o:spid="_x0000_s1026" style="position:absolute;margin-left:10.3pt;margin-top:130.8pt;width:47.55pt;height:19pt;z-index:251668480;visibility:visible;mso-wrap-style:square;mso-height-percent:0;mso-wrap-distance-left:9pt;mso-wrap-distance-top:0;mso-wrap-distance-right:9pt;mso-wrap-distance-bottom:0;mso-position-horizontal:absolute;mso-position-horizontal-relative:text;mso-position-vertical:absolute;mso-position-vertical-relative:text;mso-height-percent:0;mso-height-relative:margin;v-text-anchor:middle" o:gfxdata="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" fillcolor="#365f91 [2404]" strokecolor="#243f60 [1604]" strokeweight="2pt"/>
+              <v:rect w14:anchorId="0BFABDF4" id="Rectangle 13" o:spid="_x0000_s1026" style="position:absolute;margin-left:10.3pt;margin-top:130.8pt;width:47.55pt;height:19pt;z-index:251668480;visibility:visible;mso-wrap-style:square;mso-height-percent:0;mso-wrap-distance-left:9pt;mso-wrap-distance-top:0;mso-wrap-distance-right:9pt;mso-wrap-distance-bottom:0;mso-position-horizontal:absolute;mso-position-horizontal-relative:text;mso-position-vertical:absolute;mso-position-vertical-relative:text;mso-height-percent:0;mso-height-relative:margin;v-text-anchor:middle" o:gfxdata="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" fillcolor="#365f91 [2404]" strokecolor="#243f60 [1604]" strokeweight="2pt"/>
             </w:pict>
           </mc:Fallback>
         </mc:AlternateContent>
@@ -15532,7 +15485,7 @@
       <w:pPr>
         <w:pStyle w:val="Heading2"/>
       </w:pPr>
-      <w:bookmarkStart w:id="60" w:name="_Toc238642628"/>
+      <w:bookmarkStart w:id="56" w:name="_Toc238642628"/>
       <w:r>
         <w:rPr>
           <w:rFonts w:eastAsiaTheme="minorEastAsia"/>
@@ -15545,7 +15498,7 @@
       <w:r>
         <w:t>:</w:t>
       </w:r>
-      <w:bookmarkEnd w:id="60"/>
+      <w:bookmarkEnd w:id="56"/>
     </w:p>
     <w:p>
       <w:pPr>
@@ -15573,14 +15526,14 @@
       <w:pPr>
         <w:pStyle w:val="Heading3"/>
       </w:pPr>
-      <w:bookmarkStart w:id="61" w:name="_Toc238642629"/>
+      <w:bookmarkStart w:id="57" w:name="_Toc238642629"/>
       <w:r>
         <w:t>M</w:t>
       </w:r>
       <w:r>
         <w:t>àn hình chính</w:t>
       </w:r>
-      <w:bookmarkEnd w:id="61"/>
+      <w:bookmarkEnd w:id="57"/>
     </w:p>
     <w:p>
       <w:pPr>
@@ -15608,11 +15561,11 @@
       <w:pPr>
         <w:pStyle w:val="Heading3"/>
       </w:pPr>
-      <w:bookmarkStart w:id="62" w:name="_Toc238642630"/>
+      <w:bookmarkStart w:id="58" w:name="_Toc238642630"/>
       <w:r>
         <w:t>Màn hình tra cứu thông tin sách:</w:t>
       </w:r>
-      <w:bookmarkEnd w:id="62"/>
+      <w:bookmarkEnd w:id="58"/>
     </w:p>
     <w:p>
       <w:pPr>
@@ -15700,7 +15653,7 @@
           </mc:Choice>
           <mc:Fallback>
             <w:pict>
-              <v:rect w14:anchorId="4F7A047F" id="Rectangle 14" o:spid="_x0000_s1026" style="position:absolute;margin-left:127.45pt;margin-top:90.65pt;width:189.9pt;height:73.9pt;z-index:251664384;visibility:visible;mso-wrap-style:square;mso-wrap-distance-left:9pt;mso-wrap-distance-top:0;mso-wrap-distance-right:9pt;mso-wrap-distance-bottom:0;mso-position-horizontal:absolute;mso-position-horizontal-relative:text;mso-position-vertical:absolute;mso-position-vertical-relative:text;v-text-anchor:middle" o:gfxdata="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" filled="f" strokecolor="#f79646 [3209]" strokeweight="3pt"/>
+              <v:rect w14:anchorId="27C44687" id="Rectangle 14" o:spid="_x0000_s1026" style="position:absolute;margin-left:127.45pt;margin-top:90.65pt;width:189.9pt;height:73.9pt;z-index:251664384;visibility:visible;mso-wrap-style:square;mso-wrap-distance-left:9pt;mso-wrap-distance-top:0;mso-wrap-distance-right:9pt;mso-wrap-distance-bottom:0;mso-position-horizontal:absolute;mso-position-horizontal-relative:text;mso-position-vertical:absolute;mso-position-vertical-relative:text;v-text-anchor:middle" o:gfxdata="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" filled="f" strokecolor="#f79646 [3209]" strokeweight="3pt"/>
             </w:pict>
           </mc:Fallback>
         </mc:AlternateContent>
@@ -16242,7 +16195,7 @@
           </mc:Choice>
           <mc:Fallback>
             <w:pict>
-              <v:shapetype w14:anchorId="09F60E73" id="_x0000_t88" coordsize="21600,21600" o:spt="88" adj="1800,10800" path="m,qx10800@0l10800@2qy21600@11,10800@3l10800@1qy,21600e" filled="f">
+              <v:shapetype w14:anchorId="365E25BC" id="_x0000_t88" coordsize="21600,21600" o:spt="88" adj="1800,10800" path="m,qx10800@0l10800@2qy21600@11,10800@3l10800@1qy,21600e" filled="f">
                 <v:formulas>
                   <v:f eqn="val #0"/>
                   <v:f eqn="sum 21600 0 #0"/>
@@ -16485,7 +16438,7 @@
       <w:pPr>
         <w:pStyle w:val="Heading2"/>
       </w:pPr>
-      <w:bookmarkStart w:id="63" w:name="_Toc238642631"/>
+      <w:bookmarkStart w:id="59" w:name="_Toc238642631"/>
       <w:r>
         <w:lastRenderedPageBreak/>
         <w:t>Kiểm thử chức năng ứng dụng</w:t>
@@ -16493,7 +16446,7 @@
       <w:r>
         <w:t>:</w:t>
       </w:r>
-      <w:bookmarkEnd w:id="63"/>
+      <w:bookmarkEnd w:id="59"/>
     </w:p>
     <w:p>
       <w:pPr>
@@ -16503,7 +16456,7 @@
           <w:webHidden/>
         </w:rPr>
       </w:pPr>
-      <w:bookmarkStart w:id="64" w:name="_Toc238642632"/>
+      <w:bookmarkStart w:id="60" w:name="_Toc238642632"/>
       <w:r>
         <w:rPr>
           <w:rFonts w:eastAsiaTheme="minorEastAsia"/>
@@ -16511,7 +16464,7 @@
         </w:rPr>
         <w:t>Yêu cầu tài nguyên cho kiểm thử ứng dụng</w:t>
       </w:r>
-      <w:bookmarkEnd w:id="64"/>
+      <w:bookmarkEnd w:id="60"/>
     </w:p>
     <w:p>
       <w:pPr>
@@ -16553,7 +16506,7 @@
           <w:webHidden/>
         </w:rPr>
       </w:pPr>
-      <w:bookmarkStart w:id="65" w:name="_Toc238642633"/>
+      <w:bookmarkStart w:id="61" w:name="_Toc238642633"/>
       <w:r>
         <w:rPr>
           <w:rFonts w:eastAsiaTheme="minorEastAsia"/>
@@ -16561,17 +16514,17 @@
         </w:rPr>
         <w:t>Danh sách các tình huống kiểm thử:</w:t>
       </w:r>
-      <w:bookmarkEnd w:id="65"/>
+      <w:bookmarkEnd w:id="61"/>
     </w:p>
     <w:p>
       <w:pPr>
         <w:pStyle w:val="Heading3"/>
       </w:pPr>
-      <w:bookmarkStart w:id="66" w:name="_Toc238642634"/>
+      <w:bookmarkStart w:id="62" w:name="_Toc238642634"/>
       <w:r>
         <w:t>Test report</w:t>
       </w:r>
-      <w:bookmarkEnd w:id="66"/>
+      <w:bookmarkEnd w:id="62"/>
     </w:p>
     <w:p>
       <w:pPr>
@@ -16617,8 +16570,8 @@
         <w:ind w:left="2411"/>
         <w:jc w:val="both"/>
       </w:pPr>
-      <w:bookmarkStart w:id="67" w:name="_Toc169424253"/>
-      <w:bookmarkStart w:id="68" w:name="_Toc238642635"/>
+      <w:bookmarkStart w:id="63" w:name="_Toc169424253"/>
+      <w:bookmarkStart w:id="64" w:name="_Toc238642635"/>
       <w:r>
         <w:t>CHƯƠNG 4</w:t>
       </w:r>
@@ -16631,8 +16584,8 @@
       <w:r>
         <w:t>KẾT LUẬN</w:t>
       </w:r>
-      <w:bookmarkEnd w:id="67"/>
-      <w:bookmarkEnd w:id="68"/>
+      <w:bookmarkEnd w:id="63"/>
+      <w:bookmarkEnd w:id="64"/>
     </w:p>
     <w:p>
       <w:pPr>
@@ -16642,14 +16595,14 @@
           <w:numId w:val="0"/>
         </w:numPr>
       </w:pPr>
-      <w:bookmarkStart w:id="69" w:name="_Toc238642636"/>
+      <w:bookmarkStart w:id="65" w:name="_Toc238642636"/>
       <w:r>
         <w:t xml:space="preserve">4.1 </w:t>
       </w:r>
       <w:r>
         <w:t>Kết quả đạt được</w:t>
       </w:r>
-      <w:bookmarkEnd w:id="69"/>
+      <w:bookmarkEnd w:id="65"/>
     </w:p>
     <w:p>
       <w:pPr>
@@ -16701,14 +16654,14 @@
           <w:numId w:val="0"/>
         </w:numPr>
       </w:pPr>
-      <w:bookmarkStart w:id="70" w:name="_Toc238642637"/>
+      <w:bookmarkStart w:id="66" w:name="_Toc238642637"/>
       <w:r>
         <w:t xml:space="preserve">4.2 </w:t>
       </w:r>
       <w:r>
         <w:t>Hạn chế của đồ án</w:t>
       </w:r>
-      <w:bookmarkEnd w:id="70"/>
+      <w:bookmarkEnd w:id="66"/>
     </w:p>
     <w:p>
       <w:pPr>
@@ -16776,14 +16729,14 @@
           <w:numId w:val="0"/>
         </w:numPr>
       </w:pPr>
-      <w:bookmarkStart w:id="71" w:name="_Toc238642638"/>
+      <w:bookmarkStart w:id="67" w:name="_Toc238642638"/>
       <w:r>
         <w:t xml:space="preserve">4.3 </w:t>
       </w:r>
       <w:r>
         <w:t>Hướng phát triển</w:t>
       </w:r>
-      <w:bookmarkEnd w:id="71"/>
+      <w:bookmarkEnd w:id="67"/>
     </w:p>
     <w:p>
       <w:pPr>
@@ -16852,13 +16805,13 @@
           <w:numId w:val="0"/>
         </w:numPr>
       </w:pPr>
-      <w:bookmarkStart w:id="72" w:name="_Toc238642639"/>
-      <w:bookmarkStart w:id="73" w:name="_Toc169424254"/>
+      <w:bookmarkStart w:id="68" w:name="_Toc238642639"/>
+      <w:bookmarkStart w:id="69" w:name="_Toc169424254"/>
       <w:r>
         <w:lastRenderedPageBreak/>
         <w:t>CHƯƠNG 5: KHỞI NGHIỆP</w:t>
       </w:r>
-      <w:bookmarkEnd w:id="72"/>
+      <w:bookmarkEnd w:id="68"/>
     </w:p>
     <w:p>
       <w:pPr>
@@ -16912,8 +16865,8 @@
           <w:szCs w:val="26"/>
         </w:rPr>
       </w:pPr>
-      <w:bookmarkStart w:id="74" w:name="_Toc162955866"/>
-      <w:bookmarkStart w:id="75" w:name="_Toc238642640"/>
+      <w:bookmarkStart w:id="70" w:name="_Toc162955866"/>
+      <w:bookmarkStart w:id="71" w:name="_Toc238642640"/>
       <w:r>
         <w:t>Giải thích k</w:t>
       </w:r>
@@ -16932,8 +16885,8 @@
         </w:rPr>
         <w:t>:</w:t>
       </w:r>
-      <w:bookmarkEnd w:id="74"/>
-      <w:bookmarkEnd w:id="75"/>
+      <w:bookmarkEnd w:id="70"/>
+      <w:bookmarkEnd w:id="71"/>
     </w:p>
     <w:p/>
     <w:p>
@@ -16943,8 +16896,8 @@
           <w:szCs w:val="26"/>
         </w:rPr>
       </w:pPr>
-      <w:bookmarkStart w:id="76" w:name="_Toc162955867"/>
-      <w:bookmarkStart w:id="77" w:name="_Toc238642641"/>
+      <w:bookmarkStart w:id="72" w:name="_Toc162955867"/>
+      <w:bookmarkStart w:id="73" w:name="_Toc238642641"/>
       <w:r>
         <w:t xml:space="preserve">Dự án của các </w:t>
       </w:r>
@@ -16960,8 +16913,8 @@
         </w:rPr>
         <w:t>:</w:t>
       </w:r>
-      <w:bookmarkEnd w:id="76"/>
-      <w:bookmarkEnd w:id="77"/>
+      <w:bookmarkEnd w:id="72"/>
+      <w:bookmarkEnd w:id="73"/>
     </w:p>
     <w:p/>
     <w:p>
@@ -16977,8 +16930,8 @@
           <w:szCs w:val="28"/>
         </w:rPr>
       </w:pPr>
-      <w:bookmarkStart w:id="78" w:name="_Toc238642642"/>
-      <w:bookmarkStart w:id="79" w:name="_Toc162955868"/>
+      <w:bookmarkStart w:id="74" w:name="_Toc238642642"/>
+      <w:bookmarkStart w:id="75" w:name="_Toc162955868"/>
       <w:r>
         <w:t xml:space="preserve">Dự án của </w:t>
       </w:r>
@@ -16994,7 +16947,7 @@
         </w:rPr>
         <w:t>?</w:t>
       </w:r>
-      <w:bookmarkEnd w:id="78"/>
+      <w:bookmarkEnd w:id="74"/>
     </w:p>
     <w:p>
       <w:pPr>
@@ -17021,7 +16974,7 @@
         </w:rPr>
         <w:t xml:space="preserve"> những ý tưởng mà em cho là hay, sáng tạo</w:t>
       </w:r>
-      <w:bookmarkEnd w:id="79"/>
+      <w:bookmarkEnd w:id="75"/>
       <w:r>
         <w:rPr>
           <w:rFonts w:cs="Arial"/>
@@ -17066,12 +17019,12 @@
           <w:numId w:val="0"/>
         </w:numPr>
       </w:pPr>
-      <w:bookmarkStart w:id="80" w:name="_Toc238642643"/>
+      <w:bookmarkStart w:id="76" w:name="_Toc238642643"/>
       <w:r>
         <w:t>TÀI LIỆU THAM KHẢO</w:t>
       </w:r>
-      <w:bookmarkEnd w:id="73"/>
-      <w:bookmarkEnd w:id="80"/>
+      <w:bookmarkEnd w:id="69"/>
+      <w:bookmarkEnd w:id="76"/>
     </w:p>
     <w:p>
       <w:r>
@@ -17234,7 +17187,7 @@
           <w:noProof/>
         </w:rPr>
         <w:drawing>
-          <wp:inline distT="0" distB="0" distL="0" distR="0" wp14:anchorId="5CE39CCD" wp14:editId="4E18651B">
+          <wp:inline distT="0" distB="0" distL="0" distR="0" wp14:anchorId="5CE39CCD" wp14:editId="448C70F0">
             <wp:extent cx="5580380" cy="3687445"/>
             <wp:effectExtent l="0" t="0" r="0" b="0"/>
             <wp:docPr id="2" name="Picture 2" descr="A close-up of a document&#10;&#10;Description automatically generated"/>
@@ -17284,14 +17237,14 @@
           <w:numId w:val="0"/>
         </w:numPr>
       </w:pPr>
-      <w:bookmarkStart w:id="81" w:name="_Toc169424255"/>
-      <w:bookmarkStart w:id="82" w:name="_Toc238642644"/>
+      <w:bookmarkStart w:id="77" w:name="_Toc169424255"/>
+      <w:bookmarkStart w:id="78" w:name="_Toc238642644"/>
       <w:r>
         <w:lastRenderedPageBreak/>
         <w:t>PHỤ LỤC</w:t>
       </w:r>
-      <w:bookmarkEnd w:id="81"/>
-      <w:bookmarkEnd w:id="82"/>
+      <w:bookmarkEnd w:id="77"/>
+      <w:bookmarkEnd w:id="78"/>
     </w:p>
     <w:p>
       <w:pPr>
@@ -17302,11 +17255,11 @@
         </w:numPr>
         <w:ind w:left="567"/>
       </w:pPr>
-      <w:bookmarkStart w:id="83" w:name="_Toc238642645"/>
+      <w:bookmarkStart w:id="79" w:name="_Toc238642645"/>
       <w:r>
         <w:t>KẾ HOẠCH</w:t>
       </w:r>
-      <w:bookmarkEnd w:id="83"/>
+      <w:bookmarkEnd w:id="79"/>
     </w:p>
     <w:p>
       <w:pPr>
@@ -17344,11 +17297,11 @@
         </w:numPr>
         <w:ind w:left="567"/>
       </w:pPr>
-      <w:bookmarkStart w:id="84" w:name="_Toc238642646"/>
+      <w:bookmarkStart w:id="80" w:name="_Toc238642646"/>
       <w:r>
         <w:t>NHẬT KÝ</w:t>
       </w:r>
-      <w:bookmarkEnd w:id="84"/>
+      <w:bookmarkEnd w:id="80"/>
     </w:p>
     <w:p/>
     <w:sectPr>

</xml_diff>